<commit_message>
Shorten manuscript title to 'Surmounting the Open Sesame Barrier in Healthcare Applications'
Co-Authored-By: Claude Opus 5.5 <noreply@anthropic.com>
Claude-Session: https://claude.ai/code/session_014xEJJAs6W7wMNVWZqu14k3
</commit_message>
<xml_diff>
--- a/paper/tnnls/TNNLS_manuscript.docx
+++ b/paper/tnnls/TNNLS_manuscript.docx
@@ -9,7 +9,7 @@
       </w:pPr>
       <w:r>
         <w:rPr/>
-        <w:t xml:space="preserve">Pioneering Autonomous Intelligence in AI Systems: Surmounting the Open Sesame Barrier in Healthcare Applications Utilizing Large Language Models</w:t>
+        <w:t xml:space="preserve">Surmounting the Open Sesame Barrier in Healthcare Applications</w:t>
       </w:r>
     </w:p>
     <w:p>
@@ -4913,7 +4913,7 @@
       <w:ind w:right="360"/>
     </w:pPr>
     <w:r>
-      <w:t>&gt; ALSAWY: SURMOUNTING THE OPEN SESAME BARRIER IN HEALTHCARE LLMs &lt;</w:t>
+      <w:t>&gt; ALSAWY: SURMOUNTING THE OPEN SESAME BARRIER IN HEALTHCARE APPLICATIONS &lt;</w:t>
     </w:r>
   </w:p>
   <w:p>

</xml_diff>